<commit_message>
Edit a report for Lab_2
</commit_message>
<xml_diff>
--- a/Lab_2.docx
+++ b/Lab_2.docx
@@ -188,7 +188,6 @@
         <w:rPr>
           <w:b/>
           <w:sz w:val="36"/>
-          <w:lang w:val="en-US"/>
         </w:rPr>
       </w:pPr>
       <w:r>
@@ -1333,7 +1332,7 @@
                 <w:sz w:val="28"/>
                 <w:szCs w:val="28"/>
               </w:rPr>
-              <w:t>8</w:t>
+              <w:t>9</w:t>
             </w:r>
             <w:r>
               <w:rPr>
@@ -1508,6 +1507,9 @@
         <w:pStyle w:val="a3"/>
       </w:pPr>
       <w:r>
+        <w:rPr>
+          <w:noProof/>
+        </w:rPr>
         <w:drawing>
           <wp:inline distT="0" distB="0" distL="0" distR="0" wp14:anchorId="7C8336AC" wp14:editId="26285E3D">
             <wp:extent cx="2181225" cy="717601"/>
@@ -1586,19 +1588,44 @@
         <w:pStyle w:val="3"/>
       </w:pPr>
       <w:r>
-        <w:t>W</w:t>
+        <w:t>W = 2u</w:t>
+      </w:r>
+      <w:r>
+        <w:rPr>
+          <w:vertAlign w:val="subscript"/>
+        </w:rPr>
+        <w:t>1</w:t>
+      </w:r>
+      <w:r>
+        <w:t xml:space="preserve"> – u</w:t>
+      </w:r>
+      <w:r>
+        <w:rPr>
+          <w:vertAlign w:val="subscript"/>
+        </w:rPr>
+        <w:t>2</w:t>
       </w:r>
       <w:r>
         <w:t xml:space="preserve"> </w:t>
       </w:r>
       <w:r>
-        <w:t>=</w:t>
+        <w:t>→</w:t>
       </w:r>
       <w:r>
         <w:t xml:space="preserve"> </w:t>
       </w:r>
-      <w:r>
-        <w:t>2u</w:t>
+      <w:proofErr w:type="spellStart"/>
+      <w:r>
+        <w:t>min</w:t>
+      </w:r>
+      <w:proofErr w:type="spellEnd"/>
+    </w:p>
+    <w:p>
+      <w:pPr>
+        <w:pStyle w:val="3"/>
+      </w:pPr>
+      <w:r>
+        <w:t>v</w:t>
       </w:r>
       <w:r>
         <w:rPr>
@@ -1607,14 +1634,66 @@
         <w:t>1</w:t>
       </w:r>
       <w:r>
-        <w:t xml:space="preserve"> </w:t>
-      </w:r>
-      <w:r>
-        <w:t>–</w:t>
-      </w:r>
-      <w:r>
-        <w:t xml:space="preserve"> </w:t>
-      </w:r>
+        <w:t xml:space="preserve"> = 3u</w:t>
+      </w:r>
+      <w:r>
+        <w:rPr>
+          <w:vertAlign w:val="subscript"/>
+        </w:rPr>
+        <w:t>1</w:t>
+      </w:r>
+      <w:r>
+        <w:t xml:space="preserve"> + u</w:t>
+      </w:r>
+      <w:r>
+        <w:rPr>
+          <w:vertAlign w:val="subscript"/>
+        </w:rPr>
+        <w:t>2</w:t>
+      </w:r>
+      <w:r>
+        <w:t xml:space="preserve"> ≥ 2</w:t>
+      </w:r>
+    </w:p>
+    <w:p>
+      <w:pPr>
+        <w:pStyle w:val="3"/>
+      </w:pPr>
+      <w:r>
+        <w:t>v</w:t>
+      </w:r>
+      <w:r>
+        <w:rPr>
+          <w:vertAlign w:val="subscript"/>
+        </w:rPr>
+        <w:t>2</w:t>
+      </w:r>
+      <w:r>
+        <w:t xml:space="preserve"> = –u</w:t>
+      </w:r>
+      <w:r>
+        <w:rPr>
+          <w:vertAlign w:val="subscript"/>
+        </w:rPr>
+        <w:t>1</w:t>
+      </w:r>
+      <w:r>
+        <w:t xml:space="preserve"> – 2u</w:t>
+      </w:r>
+      <w:r>
+        <w:rPr>
+          <w:vertAlign w:val="subscript"/>
+        </w:rPr>
+        <w:t>2</w:t>
+      </w:r>
+      <w:r>
+        <w:t xml:space="preserve"> ≥ 1</w:t>
+      </w:r>
+    </w:p>
+    <w:p>
+      <w:pPr>
+        <w:pStyle w:val="3"/>
+      </w:pPr>
       <w:r>
         <w:t>u</w:t>
       </w:r>
@@ -1625,162 +1704,22 @@
         <w:t>2</w:t>
       </w:r>
       <w:r>
-        <w:t xml:space="preserve"> </w:t>
-      </w:r>
-      <w:r>
-        <w:t>→</w:t>
-      </w:r>
-      <w:r>
-        <w:t xml:space="preserve"> </w:t>
-      </w:r>
-      <w:proofErr w:type="spellStart"/>
-      <w:r>
-        <w:t>min</w:t>
-      </w:r>
-      <w:proofErr w:type="spellEnd"/>
+        <w:t xml:space="preserve"> ≥ 0</w:t>
+      </w:r>
     </w:p>
     <w:p>
       <w:pPr>
         <w:pStyle w:val="3"/>
       </w:pPr>
-      <w:r>
-        <w:t>v</w:t>
-      </w:r>
-      <w:r>
-        <w:rPr>
-          <w:vertAlign w:val="subscript"/>
-        </w:rPr>
-        <w:t>1</w:t>
-      </w:r>
-      <w:r>
-        <w:t xml:space="preserve"> </w:t>
-      </w:r>
-      <w:r>
-        <w:t>=</w:t>
-      </w:r>
-      <w:r>
-        <w:t xml:space="preserve"> </w:t>
-      </w:r>
-      <w:r>
-        <w:t>3u</w:t>
-      </w:r>
-      <w:r>
-        <w:rPr>
-          <w:vertAlign w:val="subscript"/>
-        </w:rPr>
-        <w:t>1</w:t>
-      </w:r>
-      <w:r>
-        <w:t xml:space="preserve"> </w:t>
-      </w:r>
-      <w:r>
-        <w:t>+</w:t>
-      </w:r>
-      <w:r>
-        <w:t xml:space="preserve"> </w:t>
-      </w:r>
-      <w:r>
-        <w:t>u</w:t>
-      </w:r>
-      <w:r>
-        <w:rPr>
-          <w:vertAlign w:val="subscript"/>
-        </w:rPr>
-        <w:t>2</w:t>
-      </w:r>
-      <w:r>
-        <w:t xml:space="preserve"> ≥ </w:t>
-      </w:r>
-      <w:r>
-        <w:t>2</w:t>
-      </w:r>
-    </w:p>
-    <w:p>
-      <w:pPr>
-        <w:pStyle w:val="3"/>
-      </w:pPr>
-      <w:r>
-        <w:t>v</w:t>
-      </w:r>
-      <w:r>
-        <w:rPr>
-          <w:vertAlign w:val="subscript"/>
-        </w:rPr>
-        <w:t>2</w:t>
-      </w:r>
-      <w:r>
-        <w:t xml:space="preserve"> </w:t>
-      </w:r>
-      <w:r>
-        <w:t>=</w:t>
-      </w:r>
-      <w:r>
-        <w:t xml:space="preserve"> </w:t>
-      </w:r>
-      <w:r>
-        <w:t>–u</w:t>
-      </w:r>
-      <w:r>
-        <w:rPr>
-          <w:vertAlign w:val="subscript"/>
-        </w:rPr>
-        <w:t>1</w:t>
-      </w:r>
-      <w:r>
-        <w:t xml:space="preserve"> </w:t>
-      </w:r>
-      <w:r>
-        <w:t>–</w:t>
-      </w:r>
-      <w:r>
-        <w:t xml:space="preserve"> </w:t>
-      </w:r>
-      <w:r>
-        <w:t>2u</w:t>
-      </w:r>
-      <w:r>
-        <w:rPr>
-          <w:vertAlign w:val="subscript"/>
-        </w:rPr>
-        <w:t>2</w:t>
-      </w:r>
-      <w:r>
-        <w:t xml:space="preserve"> ≥ </w:t>
-      </w:r>
-      <w:r>
-        <w:t>1</w:t>
-      </w:r>
-    </w:p>
-    <w:p>
-      <w:pPr>
-        <w:pStyle w:val="3"/>
-      </w:pPr>
-      <w:r>
-        <w:t>u</w:t>
-      </w:r>
-      <w:r>
-        <w:rPr>
-          <w:vertAlign w:val="subscript"/>
-        </w:rPr>
-        <w:t>2</w:t>
-      </w:r>
-      <w:r>
-        <w:t xml:space="preserve"> ≥ </w:t>
-      </w:r>
-      <w:r>
-        <w:t>0</w:t>
-      </w:r>
-    </w:p>
-    <w:p>
-      <w:pPr>
-        <w:pStyle w:val="3"/>
-      </w:pPr>
     </w:p>
     <w:p>
       <w:pPr>
         <w:pStyle w:val="a3"/>
       </w:pPr>
       <w:r>
+        <w:rPr>
+          <w:noProof/>
+        </w:rPr>
         <w:drawing>
           <wp:inline distT="0" distB="0" distL="0" distR="0" wp14:anchorId="5D8BC195" wp14:editId="6A50C18D">
             <wp:extent cx="2519496" cy="1266825"/>
@@ -1857,6 +1796,9 @@
         <w:pStyle w:val="a3"/>
       </w:pPr>
       <w:r>
+        <w:rPr>
+          <w:noProof/>
+        </w:rPr>
         <w:drawing>
           <wp:inline distT="0" distB="0" distL="0" distR="0" wp14:anchorId="174D90AA" wp14:editId="60C03887">
             <wp:extent cx="4320000" cy="2762702"/>
@@ -1894,6 +1836,9 @@
         </w:drawing>
       </w:r>
       <w:r>
+        <w:rPr>
+          <w:noProof/>
+        </w:rPr>
         <w:drawing>
           <wp:inline distT="0" distB="0" distL="0" distR="0" wp14:anchorId="6444BC41" wp14:editId="575FA2E0">
             <wp:extent cx="4320000" cy="2770771"/>
@@ -8410,7 +8355,129 @@
     </w:p>
     <w:p>
       <w:pPr>
+        <w:spacing w:after="160" w:line="259" w:lineRule="auto"/>
+        <w:rPr>
+          <w:sz w:val="28"/>
+          <w:lang w:val="uk-UA"/>
+        </w:rPr>
+      </w:pPr>
+      <w:r>
+        <w:rPr>
+          <w:lang w:val="uk-UA"/>
+        </w:rPr>
+        <w:br w:type="page"/>
+      </w:r>
+    </w:p>
+    <w:p>
+      <w:pPr>
+        <w:pStyle w:val="21"/>
+        <w:rPr>
+          <w:lang w:val="uk-UA"/>
+        </w:rPr>
+      </w:pPr>
+      <w:r>
+        <w:rPr>
+          <w:lang w:val="uk-UA"/>
+        </w:rPr>
+        <w:lastRenderedPageBreak/>
+        <w:t>Графічне розв’язання</w:t>
+      </w:r>
+    </w:p>
+    <w:p>
+      <w:pPr>
         <w:pStyle w:val="a3"/>
+      </w:pPr>
+      <w:r>
+        <w:drawing>
+          <wp:inline distT="0" distB="0" distL="0" distR="0" wp14:anchorId="548EDC20" wp14:editId="3A29146D">
+            <wp:extent cx="6119495" cy="2942590"/>
+            <wp:effectExtent l="0" t="0" r="0" b="0"/>
+            <wp:docPr id="4" name="Рисунок 4"/>
+            <wp:cNvGraphicFramePr>
+              <a:graphicFrameLocks xmlns:a="http://schemas.openxmlformats.org/drawingml/2006/main" noChangeAspect="1"/>
+            </wp:cNvGraphicFramePr>
+            <a:graphic xmlns:a="http://schemas.openxmlformats.org/drawingml/2006/main">
+              <a:graphicData uri="http://schemas.openxmlformats.org/drawingml/2006/picture">
+                <pic:pic xmlns:pic="http://schemas.openxmlformats.org/drawingml/2006/picture">
+                  <pic:nvPicPr>
+                    <pic:cNvPr id="1" name=""/>
+                    <pic:cNvPicPr/>
+                  </pic:nvPicPr>
+                  <pic:blipFill>
+                    <a:blip r:embed="rId12"/>
+                    <a:stretch>
+                      <a:fillRect/>
+                    </a:stretch>
+                  </pic:blipFill>
+                  <pic:spPr>
+                    <a:xfrm>
+                      <a:off x="0" y="0"/>
+                      <a:ext cx="6119495" cy="2942590"/>
+                    </a:xfrm>
+                    <a:prstGeom prst="rect">
+                      <a:avLst/>
+                    </a:prstGeom>
+                  </pic:spPr>
+                </pic:pic>
+              </a:graphicData>
+            </a:graphic>
+          </wp:inline>
+        </w:drawing>
+      </w:r>
+    </w:p>
+    <w:p>
+      <w:pPr>
+        <w:pStyle w:val="a3"/>
+      </w:pPr>
+      <w:r>
+        <w:drawing>
+          <wp:inline distT="0" distB="0" distL="0" distR="0" wp14:anchorId="46296136" wp14:editId="7CEC392C">
+            <wp:extent cx="6119495" cy="2954655"/>
+            <wp:effectExtent l="0" t="0" r="0" b="0"/>
+            <wp:docPr id="5" name="Рисунок 5"/>
+            <wp:cNvGraphicFramePr>
+              <a:graphicFrameLocks xmlns:a="http://schemas.openxmlformats.org/drawingml/2006/main" noChangeAspect="1"/>
+            </wp:cNvGraphicFramePr>
+            <a:graphic xmlns:a="http://schemas.openxmlformats.org/drawingml/2006/main">
+              <a:graphicData uri="http://schemas.openxmlformats.org/drawingml/2006/picture">
+                <pic:pic xmlns:pic="http://schemas.openxmlformats.org/drawingml/2006/picture">
+                  <pic:nvPicPr>
+                    <pic:cNvPr id="1" name=""/>
+                    <pic:cNvPicPr/>
+                  </pic:nvPicPr>
+                  <pic:blipFill>
+                    <a:blip r:embed="rId13"/>
+                    <a:stretch>
+                      <a:fillRect/>
+                    </a:stretch>
+                  </pic:blipFill>
+                  <pic:spPr>
+                    <a:xfrm>
+                      <a:off x="0" y="0"/>
+                      <a:ext cx="6119495" cy="2954655"/>
+                    </a:xfrm>
+                    <a:prstGeom prst="rect">
+                      <a:avLst/>
+                    </a:prstGeom>
+                  </pic:spPr>
+                </pic:pic>
+              </a:graphicData>
+            </a:graphic>
+          </wp:inline>
+        </w:drawing>
+      </w:r>
+    </w:p>
+    <w:p>
+      <w:pPr>
+        <w:pStyle w:val="a3"/>
+      </w:pPr>
+      <w:r>
+        <w:t>Рисунок 4 – Графічне розв’язання завдання</w:t>
+      </w:r>
+    </w:p>
+    <w:p>
+      <w:pPr>
+        <w:pStyle w:val="3"/>
       </w:pPr>
       <w:r>
         <w:br w:type="page"/>
@@ -8437,9 +8504,6 @@
       <w:pPr>
         <w:pStyle w:val="3"/>
         <w:ind w:firstLine="0"/>
-        <w:rPr>
-          <w:lang w:val="ru-RU"/>
-        </w:rPr>
       </w:pPr>
       <w:r>
         <w:rPr>
@@ -8685,7 +8749,7 @@
                     <pic:cNvPicPr/>
                   </pic:nvPicPr>
                   <pic:blipFill>
-                    <a:blip r:embed="rId12">
+                    <a:blip r:embed="rId14">
                       <a:extLst>
                         <a:ext uri="{28A0092B-C50C-407E-A947-70E740481C1C}">
                           <a14:useLocalDpi xmlns:a14="http://schemas.microsoft.com/office/drawing/2010/main" val="0"/>
@@ -8718,14 +8782,11 @@
         </w:drawing>
       </w:r>
       <w:r>
-        <w:rPr>
-          <w:lang w:val="ru-RU"/>
-        </w:rPr>
         <w:t xml:space="preserve"> </w:t>
       </w:r>
     </w:p>
     <w:sectPr>
-      <w:headerReference w:type="default" r:id="rId13"/>
+      <w:headerReference w:type="default" r:id="rId15"/>
       <w:pgSz w:w="11906" w:h="16838" w:code="9"/>
       <w:pgMar w:top="1134" w:right="851" w:bottom="1134" w:left="1418" w:header="1134" w:footer="0" w:gutter="0"/>
       <w:cols w:space="708"/>
@@ -10287,7 +10348,7 @@
 </file>
 
 <file path=customXml/itemProps1.xml><?xml version="1.0" encoding="utf-8"?>
-<ds:datastoreItem xmlns:ds="http://schemas.openxmlformats.org/officeDocument/2006/customXml" ds:itemID="{B8E844C5-8A46-4E60-A10B-8DD5770F6C98}">
+<ds:datastoreItem xmlns:ds="http://schemas.openxmlformats.org/officeDocument/2006/customXml" ds:itemID="{5D2EC710-2882-445D-B7D2-DA4C8705FBA9}">
   <ds:schemaRefs>
     <ds:schemaRef ds:uri="http://schemas.openxmlformats.org/officeDocument/2006/bibliography"/>
   </ds:schemaRefs>

</xml_diff>